<commit_message>
Add pflege/konzern features, refactor dashboard
- Add pflege_pro_bett (FI 23.8%) and ist_konzern to model; fix Konzern.csv join bug (SO.Standortnummer, not SO.QBID)
- Retrain Decision Tree: accuracy 63.6%, aerzte_pro_bett FI now 53.6%
- Move modell_klasse.py from scripts/ to model/
- Replace sidebar navigation with inline top nav bar
- Add detailed MD docs for all three notebooks and QS.Qualitätsindikator
- Add scripts: analysetabelle_zusammenfassung.py, datei_uebersicht.py, grafiken_dokumentation.py
- Update all docs, grafiken, and Word files to reflect new metrics
</commit_message>
<xml_diff>
--- a/BI_Analyse/BI_Datenanalyse.docx
+++ b/BI_Analyse/BI_Datenanalyse.docx
@@ -35,7 +35,7 @@
         <w:rPr>
           <w:sz w:val="20"/>
         </w:rPr>
-        <w:t>Datum: 29.07.2026  |  Erstellt von: Datenanalyse-Team</w:t>
+        <w:t>Datum: 30.07.2026  |  Erstellt von: Datenanalyse-Team</w:t>
       </w:r>
     </w:p>
     <w:p/>
@@ -484,7 +484,7 @@
               <w:rPr>
                 <w:sz w:val="18"/>
               </w:rPr>
-              <w:t>Schlüssel: QS.Einrichtung.ID — kein direkter Join mit SO.csv ohne Brücke. Sinnvoll NUR für eine auf Psychiatrie-Häuser beschränkte Teilanalyse. Für die allgemeine Projektfragestellung (alle ~1.900 Häuser) eingeschränkt verwendbar.</w:t>
+              <w:t>Schlüssel: QS.Einrichtung.ID — kein direkter Join mit SO.csv ohne Brücke. Sinnvoll NUR für eine auf Psychiatrie-Häuser beschränkte Teilanalyse. Für die allgemeine Projektfragestellung (alle 1.824 Häuser mit Bewertung) eingeschränkt verwendbar.</w:t>
             </w:r>
           </w:p>
         </w:tc>
@@ -769,6 +769,52 @@
         <w:tc>
           <w:tcPr>
             <w:tcW w:type="dxa" w:w="2154"/>
+            <w:shd w:fill="E2EFDA" w:val="clear"/>
+          </w:tcPr>
+          <w:p>
+            <w:r>
+              <w:rPr>
+                <w:sz w:val="18"/>
+              </w:rPr>
+              <w:t>SO.Personalliste</w:t>
+            </w:r>
+          </w:p>
+        </w:tc>
+        <w:tc>
+          <w:tcPr>
+            <w:tcW w:type="dxa" w:w="1417"/>
+            <w:shd w:fill="E2EFDA" w:val="clear"/>
+          </w:tcPr>
+          <w:p>
+            <w:r>
+              <w:rPr>
+                <w:sz w:val="18"/>
+              </w:rPr>
+              <w:t>✅ VERW</w:t>
+              <w:br/>
+              <w:t>(seit 2026-07-29)</w:t>
+            </w:r>
+          </w:p>
+        </w:tc>
+        <w:tc>
+          <w:tcPr>
+            <w:tcW w:type="dxa" w:w="6917"/>
+            <w:shd w:fill="E2EFDA" w:val="clear"/>
+          </w:tcPr>
+          <w:p>
+            <w:r>
+              <w:rPr>
+                <w:sz w:val="18"/>
+              </w:rPr>
+              <w:t>Ursprünglich als Alternativquelle eingestuft — FA.Personalliste.csv wurde für aerzte_pro_bett bevorzugt, weil sie feinere Aufschlüsselung nach Berufsgruppe ermöglicht. SO.Personalliste.csv wurde inzwischen aber selbst eingebunden: direkte Quelle für pflege_pro_bett (Filter SO.Personal.Bereich == 'Pflege'), da SO.QBID + Anzahl direkt vorhanden sind — kein Umweg über FA.csv nötig. 2. wichtigstes Merkmal (FI 23,8 %).</w:t>
+            </w:r>
+          </w:p>
+        </w:tc>
+      </w:tr>
+      <w:tr>
+        <w:tc>
+          <w:tcPr>
+            <w:tcW w:type="dxa" w:w="2154"/>
             <w:shd w:fill="FFF2CC" w:val="clear"/>
           </w:tcPr>
           <w:p>
@@ -776,7 +822,7 @@
               <w:rPr>
                 <w:sz w:val="18"/>
               </w:rPr>
-              <w:t>SO.Personalliste</w:t>
+              <w:t>QS.Leistungsbereich</w:t>
             </w:r>
           </w:p>
         </w:tc>
@@ -792,7 +838,7 @@
               </w:rPr>
               <w:t>⚠️ MOEG</w:t>
               <w:br/>
-              <w:t>(Alternativquelle)</w:t>
+              <w:t>(weiterhin offen)</w:t>
             </w:r>
           </w:p>
         </w:tc>
@@ -806,53 +852,7 @@
               <w:rPr>
                 <w:sz w:val="18"/>
               </w:rPr>
-              <w:t>Interessante Ergänzung. Wir haben FA.Personalliste.csv bevorzugt, weil sie feinere Aufschlüsselung nach Berufsgruppe (Ärzte/Pflege) ermöglicht. SO.Personalliste ist auf Standortebene aggregiert — weniger Detail. Empfehlung: Als Validierungsquelle für FA.Personalliste.csv verwenden; oder für Merkmale, die nicht auf Abteilungsebene benötigt werden.</w:t>
-            </w:r>
-          </w:p>
-        </w:tc>
-      </w:tr>
-      <w:tr>
-        <w:tc>
-          <w:tcPr>
-            <w:tcW w:type="dxa" w:w="2154"/>
-            <w:shd w:fill="E2EFDA" w:val="clear"/>
-          </w:tcPr>
-          <w:p>
-            <w:r>
-              <w:rPr>
-                <w:sz w:val="18"/>
-              </w:rPr>
-              <w:t>QS.Leistungsbereich</w:t>
-            </w:r>
-          </w:p>
-        </w:tc>
-        <w:tc>
-          <w:tcPr>
-            <w:tcW w:type="dxa" w:w="1417"/>
-            <w:shd w:fill="E2EFDA" w:val="clear"/>
-          </w:tcPr>
-          <w:p>
-            <w:r>
-              <w:rPr>
-                <w:sz w:val="18"/>
-              </w:rPr>
-              <w:t>✅ VERW</w:t>
-              <w:br/>
-              <w:t>(identifiziert)</w:t>
-            </w:r>
-          </w:p>
-        </w:tc>
-        <w:tc>
-          <w:tcPr>
-            <w:tcW w:type="dxa" w:w="6917"/>
-            <w:shd w:fill="E2EFDA" w:val="clear"/>
-          </w:tcPr>
-          <w:p>
-            <w:r>
-              <w:rPr>
-                <w:sz w:val="18"/>
-              </w:rPr>
-              <w:t>Übereinstimmung. Wir haben diese Datei als relevant identifiziert (QSLB.Dokumentationsrate = potenzielle Qualitätskennzahl), aber noch nicht eingebunden. Unterstützt die Einschätzung der Kollegen — sollte eingebunden werden.</w:t>
+              <w:t>Übereinstimmung. Wir haben diese Datei als relevant identifiziert (QSLB.Dokumentationsrate = potenzielle Qualitätskennzahl), aber bis heute (Stand 2026-07-30) nicht eingebunden. Unterstützt die Einschätzung der Kollegen — sollte eingebunden werden.</w:t>
             </w:r>
           </w:p>
         </w:tc>
@@ -944,7 +944,7 @@
               <w:rPr>
                 <w:sz w:val="18"/>
               </w:rPr>
-              <w:t>Hier weichen wir ab. QS.Landesrecht enthält länderspezifische QS-Anforderungen — diese sind nicht bundeseinheitlich und damit schlecht vergleichbar über alle ~1.900 Häuser. Risiko: Häuser in Bundesländern mit strengeren Landesregeln erscheinen systematisch 'schlechter', obwohl sie nur andere Anforderungen erfüllen müssen. Empfehlung: Nur einbinden, wenn länderspezifische Analyse gewünscht ist.</w:t>
+              <w:t>Hier weichen wir ab. QS.Landesrecht enthält länderspezifische QS-Anforderungen — diese sind nicht bundeseinheitlich und damit schlecht vergleichbar über alle 1.824 Häuser. Risiko: Häuser in Bundesländern mit strengeren Landesregeln erscheinen systematisch 'schlechter', obwohl sie nur andere Anforderungen erfüllen müssen. Empfehlung: Nur einbinden, wenn länderspezifische Analyse gewünscht ist.</w:t>
             </w:r>
           </w:p>
         </w:tc>
@@ -999,6 +999,52 @@
         <w:tc>
           <w:tcPr>
             <w:tcW w:type="dxa" w:w="2154"/>
+            <w:shd w:fill="FFF2CC" w:val="clear"/>
+          </w:tcPr>
+          <w:p>
+            <w:r>
+              <w:rPr>
+                <w:sz w:val="18"/>
+              </w:rPr>
+              <w:t>QS</w:t>
+            </w:r>
+          </w:p>
+        </w:tc>
+        <w:tc>
+          <w:tcPr>
+            <w:tcW w:type="dxa" w:w="1417"/>
+            <w:shd w:fill="FFF2CC" w:val="clear"/>
+          </w:tcPr>
+          <w:p>
+            <w:r>
+              <w:rPr>
+                <w:sz w:val="18"/>
+              </w:rPr>
+              <w:t>⚠️ MOEG</w:t>
+              <w:br/>
+              <w:t>(nicht benötigt)</w:t>
+            </w:r>
+          </w:p>
+        </w:tc>
+        <w:tc>
+          <w:tcPr>
+            <w:tcW w:type="dxa" w:w="6917"/>
+            <w:shd w:fill="FFF2CC" w:val="clear"/>
+          </w:tcPr>
+          <w:p>
+            <w:r>
+              <w:rPr>
+                <w:sz w:val="18"/>
+              </w:rPr>
+              <w:t>Korrektur (2026-07-30): QS.csv wurde ursprünglich als notwendige Brückentabelle QS-Berichtsbasis ↔ Standort eingeschätzt. Tatsächlich wird sie nie geladen — QS.Qualitätsindikator.csv trägt SO.QBID bereits selbst, ein Join über QS.csv ist für die Zusammenführung nicht nötig. QS.Typ (bund/land) könnte für eine Filterung genutzt werden, wurde aber bisher nicht geprüft.</w:t>
+            </w:r>
+          </w:p>
+        </w:tc>
+      </w:tr>
+      <w:tr>
+        <w:tc>
+          <w:tcPr>
+            <w:tcW w:type="dxa" w:w="2154"/>
             <w:shd w:fill="E2EFDA" w:val="clear"/>
           </w:tcPr>
           <w:p>
@@ -1006,7 +1052,7 @@
               <w:rPr>
                 <w:sz w:val="18"/>
               </w:rPr>
-              <w:t>QS</w:t>
+              <w:t>Konzern</w:t>
             </w:r>
           </w:p>
         </w:tc>
@@ -1022,7 +1068,7 @@
               </w:rPr>
               <w:t>✅ VERW</w:t>
               <w:br/>
-              <w:t>(Verknüpfung)</w:t>
+              <w:t>(seit 2026-07-29)</w:t>
             </w:r>
           </w:p>
         </w:tc>
@@ -1036,53 +1082,7 @@
               <w:rPr>
                 <w:sz w:val="18"/>
               </w:rPr>
-              <w:t>Übereinstimmung. QS.csv ist die Brückentabelle QS-Berichtsbasis ↔ Standort. Enthält QS.Typ (bund/land) — wichtig zum Filtern bundesweiter Indikatoren.</w:t>
-            </w:r>
-          </w:p>
-        </w:tc>
-      </w:tr>
-      <w:tr>
-        <w:tc>
-          <w:tcPr>
-            <w:tcW w:type="dxa" w:w="2154"/>
-            <w:shd w:fill="FFF2CC" w:val="clear"/>
-          </w:tcPr>
-          <w:p>
-            <w:r>
-              <w:rPr>
-                <w:sz w:val="18"/>
-              </w:rPr>
-              <w:t>Konzern</w:t>
-            </w:r>
-          </w:p>
-        </w:tc>
-        <w:tc>
-          <w:tcPr>
-            <w:tcW w:type="dxa" w:w="1417"/>
-            <w:shd w:fill="FFF2CC" w:val="clear"/>
-          </w:tcPr>
-          <w:p>
-            <w:r>
-              <w:rPr>
-                <w:sz w:val="18"/>
-              </w:rPr>
-              <w:t>⚠️ MOEG</w:t>
-              <w:br/>
-              <w:t>(interessant)</w:t>
-            </w:r>
-          </w:p>
-        </w:tc>
-        <w:tc>
-          <w:tcPr>
-            <w:tcW w:type="dxa" w:w="6917"/>
-            <w:shd w:fill="FFF2CC" w:val="clear"/>
-          </w:tcPr>
-          <w:p>
-            <w:r>
-              <w:rPr>
-                <w:sz w:val="18"/>
-              </w:rPr>
-              <w:t>Gute Ergänzung. Konzernzugehörigkeit (Konzern vs. unabhängig) ist ein potenziell relevantes Strukturmerkmal — Konzernhäuser haben möglicherweise systematisch bessere/schlechtere Qualitätswerte. Wir hatten dies identifiziert, aber nicht eingebunden. Empfehlung: Einbinden.</w:t>
+              <w:t>Gute Ergänzung — inzwischen eingebunden als Merkmal ist_konzern. Dabei wurde ein Join-Bug gefunden und behoben: Konzern.csv nutzt SO.Standortnummer als Schlüssel, nicht SO.QBID; der erste Versuch verglich fälschlich gegen SO.QBID (0 Treffer). Nach Korrektur: 358 von 1.824 Häusern (19,6 %) sind Konzernhäuser. Chi²-Test zeigt aber keinen signifikanten Zusammenhang mit Qualitätsproblemen (p=0,90) — der Decision Tree bestätigt das mit 0 % Feature Importance.</w:t>
             </w:r>
           </w:p>
         </w:tc>
@@ -1354,7 +1354,7 @@
               <w:rPr>
                 <w:sz w:val="18"/>
               </w:rPr>
-              <w:t>Vollständige Übereinstimmung. FA.Personalliste.csv ist die Hauptquelle für aerzte_pro_bett — das Merkmal mit der höchsten Feature Importance (71,3 %) im Decision Tree. Wichtig: FA.Personal.Anzahl ist Komma-Dezimal ('13,47') und muss vor der Aggregation zu float konvertiert werden.</w:t>
+              <w:t>Vollständige Übereinstimmung. FA.Personalliste.csv ist die Hauptquelle für aerzte_pro_bett — das Merkmal mit der höchsten Feature Importance (53,6 %) im Decision Tree, seit der Ergänzung um pflege_pro_bett und ist_konzern am 2026-07-29. Wichtig: FA.Personal.Anzahl ist Komma-Dezimal ('13,47') und muss vor der Aggregation zu float konvertiert werden.</w:t>
             </w:r>
           </w:p>
         </w:tc>
@@ -1409,7 +1409,7 @@
         <w:tc>
           <w:tcPr>
             <w:tcW w:type="dxa" w:w="2154"/>
-            <w:shd w:fill="FFF2CC" w:val="clear"/>
+            <w:shd w:fill="FCE4D6" w:val="clear"/>
           </w:tcPr>
           <w:p>
             <w:r>
@@ -1423,30 +1423,30 @@
         <w:tc>
           <w:tcPr>
             <w:tcW w:type="dxa" w:w="1417"/>
-            <w:shd w:fill="FFF2CC" w:val="clear"/>
+            <w:shd w:fill="FCE4D6" w:val="clear"/>
           </w:tcPr>
           <w:p>
             <w:r>
               <w:rPr>
                 <w:sz w:val="18"/>
               </w:rPr>
-              <w:t>⚠️ MOEG</w:t>
+              <w:t>❌ NEIN</w:t>
               <w:br/>
-              <w:t>(Pflegekräfte — offen)</w:t>
+              <w:t>(Ersatz gewählt)</w:t>
             </w:r>
           </w:p>
         </w:tc>
         <w:tc>
           <w:tcPr>
             <w:tcW w:type="dxa" w:w="6917"/>
-            <w:shd w:fill="FFF2CC" w:val="clear"/>
+            <w:shd w:fill="FCE4D6" w:val="clear"/>
           </w:tcPr>
           <w:p>
             <w:r>
               <w:rPr>
                 <w:sz w:val="18"/>
               </w:rPr>
-              <w:t>Sehr relevante Ergänzung. Pflegekräfte pro Bett ist laut Aufgabenstellung (Fragestellung.docx) ein explizit zu untersuchendes Merkmal — bisher noch NICHT in unsere Analysetabelle eingebunden (offener Punkt). AQ.Pflege enthält Pflegequalifikationen. Alternativ: FA.Personalliste.csv mit Filter auf FA.Personal.Bereich = 'Pflege'. Empfehlung: Dringend einbinden — komplettiert die Personalanalyse.</w:t>
+              <w:t>Pflegekräfte pro Bett ist laut Aufgabenstellung (Fragestellung.docx) ein explizit zu untersuchendes Merkmal und ist seit 2026-07-29 in der Analysetabelle (pflege_pro_bett). AQ.Pflege.csv selbst wurde aber bewusst NICHT verwendet: sie enthält nur Qualifikationsnachweise, keine Personal-Anzahlen. SO.Personalliste.csv liefert SO.QBID + SO.Personal.Anzahl direkt — kein Umweg über FA.csv nötig und detaillierter als AQ.Pflege.csv. Ergebnis: 2. wichtigstes Merkmal im Decision Tree (FI 23,8 %).</w:t>
             </w:r>
           </w:p>
         </w:tc>
@@ -1464,6 +1464,18 @@
         <w:t>4  Gesamtbewertung &amp; Empfehlungen</w:t>
       </w:r>
     </w:p>
+    <w:p>
+      <w:pPr>
+        <w:shd w:fill="DEEAF1" w:val="clear"/>
+      </w:pPr>
+      <w:r>
+        <w:rPr>
+          <w:sz w:val="20"/>
+        </w:rPr>
+        <w:t>Stand 2026-07-30: Diese Tabelle wurde aktualisiert, nachdem Konzern und SO.Personalliste tatsächlich eingebunden wurden und ein Join-Bug bei Konzern.csv sowie eine Fehleinschätzung zu QS.csv aufgefallen sind (siehe Gruppe 2 oben).</w:t>
+      </w:r>
+    </w:p>
+    <w:p/>
     <w:tbl>
       <w:tblPr>
         <w:tblStyle w:val="TableGrid"/>
@@ -1536,7 +1548,7 @@
               <w:rPr>
                 <w:sz w:val="18"/>
               </w:rPr>
-              <w:t>Vollständige Übereinstimmung (✅ + Kollegen)</w:t>
+              <w:t>Tatsächlich in Analysetabelle eingebunden (✅)</w:t>
             </w:r>
           </w:p>
         </w:tc>
@@ -1564,55 +1576,9 @@
               <w:rPr>
                 <w:sz w:val="18"/>
               </w:rPr>
-              <w:t>SO, QS, QS.Qualitätsindikator, QS.Fortbildung, QS.Leistungsbereich, FA, FA.Personalliste</w:t>
+              <w:t>SO, QS.Qualitätsindikator, QS.Fortbildung, FA, FA.Personalliste, SO.Personalliste, Konzern</w:t>
               <w:br/>
-              <w:t>→ Beide Analyseansätze bestätigen diese Auswahl unabhängig voneinander.</w:t>
-            </w:r>
-          </w:p>
-        </w:tc>
-      </w:tr>
-      <w:tr>
-        <w:tc>
-          <w:tcPr>
-            <w:tcW w:type="dxa" w:w="3118"/>
-            <w:shd w:fill="E2EFDA" w:val="clear"/>
-          </w:tcPr>
-          <w:p>
-            <w:r>
-              <w:rPr>
-                <w:sz w:val="18"/>
-              </w:rPr>
-              <w:t>Sinnvolle Ergänzungen durch Kollegen (⚠️ → jetzt VERW)</w:t>
-            </w:r>
-          </w:p>
-        </w:tc>
-        <w:tc>
-          <w:tcPr>
-            <w:tcW w:type="dxa" w:w="1134"/>
-            <w:shd w:fill="E2EFDA" w:val="clear"/>
-          </w:tcPr>
-          <w:p>
-            <w:r>
-              <w:rPr>
-                <w:sz w:val="18"/>
-              </w:rPr>
-              <w:t>3</w:t>
-            </w:r>
-          </w:p>
-        </w:tc>
-        <w:tc>
-          <w:tcPr>
-            <w:tcW w:type="dxa" w:w="6236"/>
-            <w:shd w:fill="E2EFDA" w:val="clear"/>
-          </w:tcPr>
-          <w:p>
-            <w:r>
-              <w:rPr>
-                <w:sz w:val="18"/>
-              </w:rPr>
-              <w:t>Konzern, AQ.Pflege, SO.Personalliste (als Validierung)</w:t>
-              <w:br/>
-              <w:t>→ Sollten in die Analysetabelle aufgenommen werden.</w:t>
+              <w:t>→ Kernauswahl bestätigt; SO.Personalliste und Konzern kamen am 2026-07-29 hinzu.</w:t>
             </w:r>
           </w:p>
         </w:tc>
@@ -1628,7 +1594,7 @@
               <w:rPr>
                 <w:sz w:val="18"/>
               </w:rPr>
-              <w:t>Technische Einschränkung beachten (Psychiatrie-Gruppe)</w:t>
+              <w:t>Identifiziert, aber weiterhin nicht eingebunden (⚠️)</w:t>
             </w:r>
           </w:p>
         </w:tc>
@@ -1642,7 +1608,7 @@
               <w:rPr>
                 <w:sz w:val="18"/>
               </w:rPr>
-              <w:t>3</w:t>
+              <w:t>7</w:t>
             </w:r>
           </w:p>
         </w:tc>
@@ -1656,9 +1622,9 @@
               <w:rPr>
                 <w:sz w:val="18"/>
               </w:rPr>
-              <w:t>QS.Pso, QS.Psy, QS.Struktur.Station</w:t>
+              <w:t>QS (nicht benötigt — SO.QBID bereits in QS.Qualitätsindikator enthalten), QS.Leistungsbereich, QS.Behandlungsumfang, AQ.Ärzte, QS.Pso, QS.Psy, QS.Struktur.Station</w:t>
               <w:br/>
-              <w:t>→ Nur für Psychiatrie-Teilanalyse geeignet (anderer Join-Schlüssel: QS.Einrichtung.ID).</w:t>
+              <w:t>→ QS.Leistungsbereich bleibt der aussichtsreichste Kandidat für eine künftige Ergänzung.</w:t>
             </w:r>
           </w:p>
         </w:tc>
@@ -1674,7 +1640,7 @@
               <w:rPr>
                 <w:sz w:val="18"/>
               </w:rPr>
-              <w:t>Lookup-Tabellen — kein Analysewert als Feature</w:t>
+              <w:t>Lookup-Tabellen — kein Analysewert als Feature (❌)</w:t>
             </w:r>
           </w:p>
         </w:tc>
@@ -1720,7 +1686,7 @@
               <w:rPr>
                 <w:sz w:val="18"/>
               </w:rPr>
-              <w:t>Abweichung — wir empfehlen NEIN</w:t>
+              <w:t>Abweichung / bewusster Ersatz (❌)</w:t>
             </w:r>
           </w:p>
         </w:tc>
@@ -1734,7 +1700,7 @@
               <w:rPr>
                 <w:sz w:val="18"/>
               </w:rPr>
-              <w:t>2</w:t>
+              <w:t>3</w:t>
             </w:r>
           </w:p>
         </w:tc>
@@ -1748,9 +1714,9 @@
               <w:rPr>
                 <w:sz w:val="18"/>
               </w:rPr>
-              <w:t>QS.Landesrecht (nicht vergleichbar über Bundesländer), Akademische_Lehre (in SO.Uni enthalten)</w:t>
+              <w:t>QS.Landesrecht (nicht vergleichbar über Bundesländer), Akademische_Lehre (in SO.Uni enthalten), AQ.Pflege (durch SO.Personalliste ersetzt, da detaillierter)</w:t>
               <w:br/>
-              <w:t>→ Nur nach weiterer Prüfung einbinden.</w:t>
+              <w:t>→ Bewusste, begründete Entscheidungen — kein offener Punkt.</w:t>
             </w:r>
           </w:p>
         </w:tc>
@@ -1810,7 +1776,7 @@
           <w:color w:val="1F497D"/>
           <w:sz w:val="21"/>
         </w:rPr>
-        <w:t>Fazit: Die BI-Tool-Analyse der Kollegen ist insgesamt gut und bestätigt unsere Kernauswahl. Die größte Erkenntnis ist die Ergänzung um AQ.Pflege (Pflegekräfte — offener Punkt bei uns) und Konzern (Konzernzugehörigkeit als Strukturmerkmal). Bei der Psychiatrie-Gruppe sollte der abweichende Join-Schlüssel vor der Einbindung technisch gelöst werden.</w:t>
+        <w:t>Fazit: Die BI-Tool-Analyse der Kollegen war insgesamt gut und hat unsere Kernauswahl bestätigt sowie zwei echte Lücken aufgedeckt. Konzern und SO.Personalliste (für pflege_pro_bett) wurden am 2026-07-29 eingebunden — bei Konzern.csv fiel dabei zusätzlich ein Join-Bug auf (falscher Schlüssel, 0 Treffer), der erst durch die erneute Prüfung dieser Empfehlung entdeckt wurde. AQ.Pflege wurde bewusst NICHT übernommen, da SO.Personalliste.csv denselben Zweck detaillierter erfüllt. Bei der Psychiatrie-Gruppe bleibt der abweichende Join-Schlüssel (QS.Einrichtung.ID) weiterhin ungelöst — nur relevant für eine Psychiatrie-Teilanalyse.</w:t>
       </w:r>
     </w:p>
     <w:sectPr>

</xml_diff>